<commit_message>
docs(pitch): 软著申请材料 + 全量截图刷成 RLab Cortex
- 白皮书 V1.0_修订版(11 图)与基础版(6 图)、产品使用手册截图全部更新为 RLab Cortex 界面
- 新增软著操作手册(ROMTEK 工程数据智能分析软件 · 简称 RLab Cortex),含登录界面、
  完整连贯操作实录(上传→对话出图→流水线→血缘→灵敏度→高级图),体现数据变化
- 新增软著源代码清单 RLab_Cortex_源代码_软著.txt(17 文件/约 3072 行,登录界面在前,含 RLab Cortex)
- 新增登录界面与操作走查截图(clean_login / op_*),新增两个生成脚本 tools/gen_ruanzhu_*

Co-Authored-By: Claude Opus 4.8 <noreply@anthropic.com>
</commit_message>
<xml_diff>
--- a/docs/pitch/RLab_Cortex_产品使用手册.docx
+++ b/docs/pitch/RLab_Cortex_产品使用手册.docx
@@ -78,7 +78,7 @@
       <w:r>
         <w:drawing>
           <wp:inline xmlns:a="http://schemas.openxmlformats.org/drawingml/2006/main" xmlns:pic="http://schemas.openxmlformats.org/drawingml/2006/picture">
-            <wp:extent cx="5669280" cy="3933063"/>
+            <wp:extent cx="5669280" cy="3553930"/>
             <wp:docPr id="1" name="Picture 1"/>
             <wp:cNvGraphicFramePr>
               <a:graphicFrameLocks noChangeAspect="1"/>
@@ -99,7 +99,7 @@
                   <pic:spPr>
                     <a:xfrm>
                       <a:off x="0" y="0"/>
-                      <a:ext cx="5669280" cy="3933063"/>
+                      <a:ext cx="5669280" cy="3553930"/>
                     </a:xfrm>
                     <a:prstGeom prst="rect"/>
                   </pic:spPr>
@@ -2146,7 +2146,7 @@
       <w:r>
         <w:drawing>
           <wp:inline xmlns:a="http://schemas.openxmlformats.org/drawingml/2006/main" xmlns:pic="http://schemas.openxmlformats.org/drawingml/2006/picture">
-            <wp:extent cx="5486400" cy="4035933"/>
+            <wp:extent cx="5486400" cy="3439287"/>
             <wp:docPr id="2" name="Picture 2"/>
             <wp:cNvGraphicFramePr>
               <a:graphicFrameLocks noChangeAspect="1"/>
@@ -2167,7 +2167,7 @@
                   <pic:spPr>
                     <a:xfrm>
                       <a:off x="0" y="0"/>
-                      <a:ext cx="5486400" cy="4035933"/>
+                      <a:ext cx="5486400" cy="3439287"/>
                     </a:xfrm>
                     <a:prstGeom prst="rect"/>
                   </pic:spPr>
@@ -3478,7 +3478,7 @@
       <w:r>
         <w:drawing>
           <wp:inline xmlns:a="http://schemas.openxmlformats.org/drawingml/2006/main" xmlns:pic="http://schemas.openxmlformats.org/drawingml/2006/picture">
-            <wp:extent cx="5669280" cy="1980705"/>
+            <wp:extent cx="5669280" cy="3553930"/>
             <wp:docPr id="4" name="Picture 4"/>
             <wp:cNvGraphicFramePr>
               <a:graphicFrameLocks noChangeAspect="1"/>
@@ -3499,7 +3499,7 @@
                   <pic:spPr>
                     <a:xfrm>
                       <a:off x="0" y="0"/>
-                      <a:ext cx="5669280" cy="1980705"/>
+                      <a:ext cx="5669280" cy="3553930"/>
                     </a:xfrm>
                     <a:prstGeom prst="rect"/>
                   </pic:spPr>
@@ -3758,7 +3758,7 @@
       <w:r>
         <w:drawing>
           <wp:inline xmlns:a="http://schemas.openxmlformats.org/drawingml/2006/main" xmlns:pic="http://schemas.openxmlformats.org/drawingml/2006/picture">
-            <wp:extent cx="5486400" cy="3336417"/>
+            <wp:extent cx="5486400" cy="3439287"/>
             <wp:docPr id="5" name="Picture 5"/>
             <wp:cNvGraphicFramePr>
               <a:graphicFrameLocks noChangeAspect="1"/>
@@ -3779,7 +3779,7 @@
                   <pic:spPr>
                     <a:xfrm>
                       <a:off x="0" y="0"/>
-                      <a:ext cx="5486400" cy="3336417"/>
+                      <a:ext cx="5486400" cy="3439287"/>
                     </a:xfrm>
                     <a:prstGeom prst="rect"/>
                   </pic:spPr>
@@ -4490,7 +4490,7 @@
       <w:r>
         <w:drawing>
           <wp:inline xmlns:a="http://schemas.openxmlformats.org/drawingml/2006/main" xmlns:pic="http://schemas.openxmlformats.org/drawingml/2006/picture">
-            <wp:extent cx="5486400" cy="4003263"/>
+            <wp:extent cx="5486400" cy="3439287"/>
             <wp:docPr id="6" name="Picture 6"/>
             <wp:cNvGraphicFramePr>
               <a:graphicFrameLocks noChangeAspect="1"/>
@@ -4511,7 +4511,7 @@
                   <pic:spPr>
                     <a:xfrm>
                       <a:off x="0" y="0"/>
-                      <a:ext cx="5486400" cy="4003263"/>
+                      <a:ext cx="5486400" cy="3439287"/>
                     </a:xfrm>
                     <a:prstGeom prst="rect"/>
                   </pic:spPr>

</xml_diff>